<commit_message>
Undécima revisión: contraste en modo oscuro, CSS, avisos, diagramas de la base y documentos
- Web: rojo propio del modo oscuro, puntos y coma faltantes en styles.css,
  avisos largos que se salían de la pantalla, verde del tema en los mensajes.
- Base: comentarios de schema.sql corregidos y SQL completo regenerado.
- ERD y DER_Negocio: columna creado_por_invitado (migración 019), también
  dentro de la Documentación de Proyecto.
- Planillas: componentes de la placa completos (capacitor 470 µF y Nivel 2),
  checklist con los códigos de error del monitor serie.
- Word y LEEME: bobinas (cuatro, confirmado el 19/09), columnas 1 a 8,
  cantidades actualizadas, referencias inexistentes y marcas de comentario rotas.

Co-Authored-By: Claude Opus 5.5 <noreply@anthropic.com>
Claude-Session: https://claude.ai/code/session_01QiY8ZZNAM9gwPKiqSkCaaj
</commit_message>
<xml_diff>
--- a/documentacion_proyecto/Bitácora.docx
+++ b/documentacion_proyecto/Bitácora.docx
@@ -1695,7 +1695,7 @@
           <w:szCs w:val="22"/>
           <w:rtl w:val="0"/>
         </w:rPr>
-        <w:t xml:space="preserve">Cómo funciona: en cada pasada del telar, algunos marcos suben y otros bajan; esa combinación forma el cruce de hilos que da el dibujo. Cada pasada se reduce entonces a indicar cuáles de esos elementos se activan. En el relevamiento del 28/08/26 se confirmó que este telar cuenta con seis bobinas de selección en funcionamiento, correspondientes a los seis bobinas de hilo que la máquina admite en simultáneo; el sistema no fija esa cantidad, y el editor admite de 2 a 32 columnas para adaptarse a otras configuraciones. El patrón repetitivo es una lista corta de esas combinaciones que se repite en bucle. El backend le entrega esa secuencia al ESP32, y el ESP32 energiza en cada pasada los marcos que van arriba.</w:t>
+        <w:t xml:space="preserve">Cómo funciona: en cada pasada del telar, algunos marcos suben y otros bajan; esa combinación forma el cruce de hilos que da el dibujo. Cada pasada se reduce entonces a indicar cuáles de esos elementos se activan. El dueño confirmó el 19/09/26 que este telar cuenta con cuatro bobinas de selección en funcionamiento (el relevamiento del 28/08/26 había estimado seis); el sistema no fija esa cantidad, y el editor admite de 1 a 8 columnas para adaptarse a otras configuraciones. El patrón repetitivo es una lista corta de esas combinaciones que se repite en bucle. El backend le entrega esa secuencia al ESP32, y el ESP32 energiza en cada pasada los marcos que van arriba.</w:t>
       </w:r>
     </w:p>
     <w:p>
@@ -4387,7 +4387,7 @@
           <w:szCs w:val="22"/>
           <w:rtl w:val="0"/>
         </w:rPr>
-        <w:t xml:space="preserve">Revisión 3, se descarta la vía de actuadores rotativos para el Nivel 2 y se define el camino único con solenoides. Se suma la Guía de Medición del Telar, se reescriben el nivel 2 de control de marcos, los niveles de control, las recomendaciones elèctricas y sincronizaciòn por pasadas, se actualiza la Lista de Componentes (Bloques A-D) y se agrega el firmware del Nivel 2 (74HC595 + MOSFETs) con su verificación (sim_nivel2.py, 11/11 verificaciones OK).</w:t>
+        <w:t xml:space="preserve">Revisión 3, se descarta la vía de actuadores rotativos para el Nivel 2 y se define el camino único con solenoides. Se suma la Guía de mediciones y verificaciones, se reescriben el nivel 2 de control de marcos, los niveles de control, las recomendaciones elèctricas y sincronizaciòn por pasadas, se actualiza la Lista de Componentes (Bloques A-D) y se agrega el firmware del Nivel 2 (74HC595 + MOSFETs) con su verificación (sim_nivel2.py, 11/11 verificaciones OK).</w:t>
       </w:r>
     </w:p>
     <w:p>
@@ -4694,7 +4694,7 @@
           <w:szCs w:val="22"/>
           <w:rtl w:val="0"/>
         </w:rPr>
-        <w:t xml:space="preserve">01/09/2026: Revisión integral de la documentación conforme al manual de buenas prácticas de la UTN. Se incorporó el índice, se convirtieron en tabla las definiciones, las características de los usuarios y los requerimientos funcionales y no funcionales, y se agregaron las secciones de interfaces de hardware y de limitaciones del alcance. Se sumaron el modelo entidad-relación de la base de datos, el plan de respaldo y recuperación, el organigrama del equipo y las figuras del cronograma y de la estructura de costos. Se actualizaron la lista de componentes y la estimación económica con los valores vigentes, y se resolvieron dos contradicciones detectadas entre documentos: el armado se entrega sobre placa universal soldada y no sobre protoboard, y se confirmó que el sensor de pasada del Bloque C forma parte del alcance de esta etapa. En el relevamiento se confirmó que el telar cuenta con seis bobinas de selección en funcionamiento, correspondientes a los seis bobinas de hilo que la máquina admite en simultáneo.</w:t>
+        <w:t xml:space="preserve">01/09/2026: Revisión integral de la documentación conforme al manual de buenas prácticas de la UTN. Se incorporó el índice, se convirtieron en tabla las definiciones, las características de los usuarios y los requerimientos funcionales y no funcionales, y se agregaron las secciones de interfaces de hardware y de limitaciones del alcance. Se sumaron el modelo entidad-relación de la base de datos, el plan de respaldo y recuperación, el organigrama del equipo y las figuras del cronograma y de la estructura de costos. Se actualizaron la lista de componentes y la estimación económica con los valores vigentes, y se resolvieron dos contradicciones detectadas entre documentos: el armado se entrega sobre placa universal soldada y no sobre protoboard, y se confirmó que el sensor de pasada del Bloque C forma parte del alcance de esta etapa. En el relevamiento se confirmó que el telar cuenta con seis bobinas de selección en funcionamiento, correspondientes a las seis bobinas de hilo que la máquina admite en simultáneo.</w:t>
       </w:r>
       <w:r>
         <w:rPr>

</xml_diff>

<commit_message>
Documentación: visita del 10/10 (prueba en protoboard, plaqueta en armado), componentes nuevos y funciones nuevas
- Registro de entrevistas y bitácora: reunión 7 del 10/10/2026; la conexión final pasa a ser la 8.
- Lista de componentes y componentes en placa: otra plaqueta y tiras de pines (19 de 2, 6 de 5, 4 de 6, 2 de 8).
- Manuales, estado del proyecto y documentación: una bobina por fila, Intercalar, hilado en la
  ficha y el PDF, estado del Nivel 2 (probado en protoboard, plaqueta en armado).
- Comentarios del esquema, el firmware y los README al día con la regla de una bobina por fila.

Co-Authored-By: Claude Opus 5.5 <noreply@anthropic.com>
Claude-Session: https://claude.ai/code/session_01QiY8ZZNAM9gwPKiqSkCaaj
</commit_message>
<xml_diff>
--- a/documentacion_proyecto/Bitácora.docx
+++ b/documentacion_proyecto/Bitácora.docx
@@ -2787,6 +2787,100 @@
                 <w:szCs w:val="22"/>
                 <w:rtl w:val="0"/>
               </w:rPr>
+              <w:t>10/10/2026</w:t>
+            </w:r>
+          </w:p>
+        </w:tc>
+        <w:tc>
+          <w:tcPr/>
+          <w:p>
+            <w:pPr>
+              <w:rPr>
+                <w:rFonts w:ascii="IBM Plex Sans" w:cs="IBM Plex Sans" w:eastAsia="IBM Plex Sans" w:hAnsi="IBM Plex Sans"/>
+                <w:sz w:val="22"/>
+                <w:szCs w:val="22"/>
+              </w:rPr>
+            </w:pPr>
+            <w:r>
+              <w:rPr>
+                <w:rFonts w:ascii="IBM Plex Sans" w:cs="IBM Plex Sans" w:eastAsia="IBM Plex Sans" w:hAnsi="IBM Plex Sans"/>
+                <w:b w:val="0"/>
+                <w:sz w:val="22"/>
+                <w:szCs w:val="22"/>
+                <w:rtl w:val="0"/>
+              </w:rPr>
+              <w:t>Dueño de la Fábrica Textil / Empleado</w:t>
+            </w:r>
+          </w:p>
+        </w:tc>
+        <w:tc>
+          <w:tcPr/>
+          <w:p>
+            <w:pPr>
+              <w:rPr>
+                <w:rFonts w:ascii="IBM Plex Sans" w:cs="IBM Plex Sans" w:eastAsia="IBM Plex Sans" w:hAnsi="IBM Plex Sans"/>
+                <w:sz w:val="22"/>
+                <w:szCs w:val="22"/>
+              </w:rPr>
+            </w:pPr>
+            <w:r>
+              <w:rPr>
+                <w:rFonts w:ascii="IBM Plex Sans" w:cs="IBM Plex Sans" w:eastAsia="IBM Plex Sans" w:hAnsi="IBM Plex Sans"/>
+                <w:b w:val="0"/>
+                <w:sz w:val="22"/>
+                <w:szCs w:val="22"/>
+                <w:rtl w:val="0"/>
+              </w:rPr>
+              <w:t>Prueba en protoboard del Nivel 2 (sensor de pasada y relé de selección), armado de la plaqueta y pedidos para la aplicación</w:t>
+            </w:r>
+          </w:p>
+        </w:tc>
+        <w:tc>
+          <w:tcPr/>
+          <w:p>
+            <w:pPr>
+              <w:rPr>
+                <w:rFonts w:ascii="IBM Plex Sans" w:cs="IBM Plex Sans" w:eastAsia="IBM Plex Sans" w:hAnsi="IBM Plex Sans"/>
+                <w:sz w:val="22"/>
+                <w:szCs w:val="22"/>
+              </w:rPr>
+            </w:pPr>
+            <w:r>
+              <w:rPr>
+                <w:rFonts w:ascii="IBM Plex Sans" w:cs="IBM Plex Sans" w:eastAsia="IBM Plex Sans" w:hAnsi="IBM Plex Sans"/>
+                <w:b w:val="0"/>
+                <w:sz w:val="22"/>
+                <w:szCs w:val="22"/>
+                <w:rtl w:val="0"/>
+              </w:rPr>
+              <w:t>Presencial</w:t>
+            </w:r>
+          </w:p>
+        </w:tc>
+      </w:tr>
+      <w:tr>
+        <w:trPr>
+          <w:cantSplit w:val="0"/>
+          <w:tblHeader w:val="0"/>
+        </w:trPr>
+        <w:tc>
+          <w:tcPr/>
+          <w:p>
+            <w:pPr>
+              <w:rPr>
+                <w:rFonts w:ascii="IBM Plex Sans" w:cs="IBM Plex Sans" w:eastAsia="IBM Plex Sans" w:hAnsi="IBM Plex Sans"/>
+                <w:sz w:val="22"/>
+                <w:szCs w:val="22"/>
+              </w:rPr>
+            </w:pPr>
+            <w:r>
+              <w:rPr>
+                <w:rFonts w:ascii="IBM Plex Sans" w:cs="IBM Plex Sans" w:eastAsia="IBM Plex Sans" w:hAnsi="IBM Plex Sans"/>
+                <w:b w:val="0"/>
+                <w:sz w:val="22"/>
+                <w:szCs w:val="22"/>
+                <w:rtl w:val="0"/>
+              </w:rPr>
               <w:t>Pendiente</w:t>
             </w:r>
           </w:p>
@@ -4867,6 +4961,27 @@
           <w:rtl w:val="0"/>
         </w:rPr>
         <w:t>23-24/09/2026: Se cambia el componente del Bloque D por el relé OptoMOS LCA110 (IXYS), del mismo tipo que el AQY212GH elegido el 08/09, que no llegó a comprarse: salida MOSFET, sin corriente mínima y con aislamiento entre el ESP32 y el telar. El LCA110 se consigue en el mercado local en encapsulado DIP de 6 patas, soporta 350 V y 120 mA, y se activa con 2 mA en su LED. Se prevén cuatro, uno por bobina.</w:t>
+      </w:r>
+    </w:p>
+    <w:p>
+      <w:pPr>
+        <w:jc w:val="both"/>
+        <w:rPr>
+          <w:rFonts w:ascii="IBM Plex Sans" w:cs="IBM Plex Sans" w:eastAsia="IBM Plex Sans" w:hAnsi="IBM Plex Sans"/>
+          <w:sz w:val="22"/>
+          <w:szCs w:val="22"/>
+        </w:rPr>
+      </w:pPr>
+      <w:r>
+        <w:rPr>
+          <w:rFonts w:ascii="IBM Plex Sans" w:cs="IBM Plex Sans" w:eastAsia="IBM Plex Sans" w:hAnsi="IBM Plex Sans"/>
+          <w:b w:val="1"/>
+          <w:bCs w:val="1"/>
+          <w:sz w:val="22"/>
+          <w:szCs w:val="22"/>
+          <w:rtl w:val="0"/>
+        </w:rPr>
+        <w:t xml:space="preserve">10/10/2026: Visita a la fábrica. Se probó todo el circuito del Nivel 2 en protoboard (el sensor de pasada y el relé de selección LCA110 con el ESP32) y funcionó. Se está haciendo la plaqueta para probar todo de manera correcta, y a la lista de componentes se suman otra plaqueta y tiras de pines (19 de 2, 6 de 5, 4 de 6 y 2 de 8). Surgieron pedidos para la aplicación, ya incorporados: cargar el peso del hilado y los metros de tela que alcanza a tejer, con el hilado usado, el restante y los metros que faltan en la ficha en PDF (que deja de mostrar las vueltas completas); una sola bobina por fila, porque en cada pasada entra una sola trama; una herramienta para intercalar bobinas (por ejemplo 1, 3 y 2, repetidas hasta 120 pasadas); y que en el celular el teclado no se cierre al cargar las pasadas de cada fila.</w:t>
       </w:r>
     </w:p>
     <w:sectPr>

</xml_diff>

<commit_message>
Documentos al día: Bitácora del 11/10, Estado del proyecto y el índice de documentos
Co-Authored-By: Claude Opus 5.5 <noreply@anthropic.com>
Claude-Session: https://claude.ai/code/session_01QiY8ZZNAM9gwPKiqSkCaaj
</commit_message>
<xml_diff>
--- a/documentacion_proyecto/Bitácora.docx
+++ b/documentacion_proyecto/Bitácora.docx
@@ -4982,6 +4982,27 @@
           <w:rtl w:val="0"/>
         </w:rPr>
         <w:t xml:space="preserve">10/10/2026: Visita a la fábrica. Se probó todo el circuito del Nivel 2 en protoboard (el sensor de pasada y el relé de selección LCA110 con el ESP32) y funcionó. Se está haciendo la plaqueta para probar todo de manera correcta, y a la lista de componentes se suman otra plaqueta y tiras de pines (19 de 2, 6 de 5, 4 de 6 y 2 de 8). Surgieron pedidos para la aplicación, ya incorporados: cargar el peso del hilado y los metros de tela que alcanza a tejer, con el hilado usado, el restante y los metros que faltan en la ficha en PDF (que deja de mostrar las vueltas completas); una sola bobina por fila, porque en cada pasada entra una sola trama; una herramienta para intercalar bobinas (por ejemplo 1, 3 y 2, repetidas hasta 120 pasadas); y que en el celular el teclado no se cierre al cargar las pasadas de cada fila.</w:t>
+      </w:r>
+    </w:p>
+    <w:p>
+      <w:pPr>
+        <w:jc w:val="both"/>
+        <w:rPr>
+          <w:rFonts w:ascii="IBM Plex Sans" w:cs="IBM Plex Sans" w:eastAsia="IBM Plex Sans" w:hAnsi="IBM Plex Sans"/>
+          <w:sz w:val="22"/>
+          <w:szCs w:val="22"/>
+        </w:rPr>
+      </w:pPr>
+      <w:r>
+        <w:rPr>
+          <w:rFonts w:ascii="IBM Plex Sans" w:cs="IBM Plex Sans" w:eastAsia="IBM Plex Sans" w:hAnsi="IBM Plex Sans"/>
+          <w:b w:val="1"/>
+          <w:bCs w:val="1"/>
+          <w:sz w:val="22"/>
+          <w:szCs w:val="22"/>
+          <w:rtl w:val="0"/>
+        </w:rPr>
+        <w:t xml:space="preserve">11/10/2026: Con los datos de la planta (con agujero, el lector da la señal que activa la bobina; mientras la misma bobina se repite, el relé queda activo y la aguja va y vuelve) se definió la conexión final de los relés LCA110, la más segura: el relé en el lugar del lector, con una resistencia de protección en serie (220 Ω 2 W hasta 15 V o 470 Ω 3 W de 15 a 30 V) y una de 10 kΩ ½ W de la señal al negativo. Se actualizaron los diagramas, las guías y las planillas de componentes. La ficha técnica en PDF pasó a mostrar el telar con más detalle (con los alimentadores de trama), una llave por vuelta y una regla a escala, sin el modelo del telar ni el recuadro de instrucciones. Se escribió el paso a paso de conexión y puesta en marcha, con las cuatro plaquetas del gabinete y su cableado.</w:t>
       </w:r>
     </w:p>
     <w:sectPr>

</xml_diff>

<commit_message>
Revisión: el cronograma reorganizado en todos los documentos
El diagrama del Gantt, la Documentación de Proyecto (6.1 y 10.3), el Estado
completo, el LEEME y la Bitácora pasan a las 166 tareas y a las etapas y fechas
reales. El PDF del resumen de conexiones va a la carpeta PDF. En un celular, la
pasada de la barra del editor ya no se corta en dos líneas.

Co-Authored-By: Claude Opus 5.5 <noreply@anthropic.com>
Claude-Session: https://claude.ai/code/session_01QiY8ZZNAM9gwPKiqSkCaaj
</commit_message>
<xml_diff>
--- a/documentacion_proyecto/Bitácora.docx
+++ b/documentacion_proyecto/Bitácora.docx
@@ -5139,6 +5139,48 @@
           <w:rtl w:val="0"/>
         </w:rPr>
         <w:t xml:space="preserve">Se separó el sensado de la botonera en una plaqueta propia, impresa (la plaqueta 5), que se une a la principal por el conector J4 (3,3 V, GND y GPIO 32, 33 y 34): el gabinete pasa a tener cinco plaquetas. Cada canal de sensado lleva un capacitor de 22 µF 50 V después del puente, que mantiene encendido el LED del optoacoplador entre semiciclos (sin él, se apagaría 100 veces por segundo y saldrían avisos solos); con ese valor, el botón tiene que mantenerse apretado entre 0,15 y 0,25 s para registrarse. El firmware descarta los avisos cuando dos o más canales de la botonera bajan juntos (dentro de 150 ms), que es lo que pasa al prender el telar con el gabinete encendido. Se hizo además una revisión completa del código, los documentos, las planillas y los diagramas.</w:t>
+      </w:r>
+    </w:p>
+    <w:p>
+      <w:pPr>
+        <w:jc w:val="both"/>
+        <w:rPr>
+          <w:rFonts w:ascii="IBM Plex Sans" w:cs="IBM Plex Sans" w:eastAsia="IBM Plex Sans" w:hAnsi="IBM Plex Sans"/>
+          <w:sz w:val="22"/>
+          <w:szCs w:val="22"/>
+        </w:rPr>
+      </w:pPr>
+      <w:r>
+        <w:rPr>
+          <w:rFonts w:ascii="IBM Plex Sans" w:cs="IBM Plex Sans" w:eastAsia="IBM Plex Sans" w:hAnsi="IBM Plex Sans"/>
+          <w:b w:val="1"/>
+          <w:bCs w:val="1"/>
+          <w:sz w:val="22"/>
+          <w:szCs w:val="22"/>
+          <w:rtl w:val="0"/>
+        </w:rPr>
+        <w:t xml:space="preserve">16/10/2026: Se armó el resumen de las conexiones de las cinco plaquetas para quien las arma (Conexiones_de_las_plaquetas.docx): qué lleva cada plaqueta, los conectores J1 a J4 y las borneras B1 a B3, el mapa de pines del ESP32 y la conexión pata por pata. Al revisar el diseño en curso en Proteus se marcaron seis correcciones: los relés LCA110 van en los GPIO 18, 19, 21 y 22; los capacitores del sensado, de 22 µF 50 V; el sensor se alimenta del telar, sin bornera aparte; los LCA110 van en zócalos DIP-6; la bornera de cada botón es doble, y el capacitor de la entrada de 5 V es de 470 µF. También se reorganizó el Gantt con las fechas reales: 166 tareas en 8 etapas, sin tareas repetidas, con la presentación a los profesores el 04/11/2026.</w:t>
+      </w:r>
+    </w:p>
+    <w:p>
+      <w:pPr>
+        <w:jc w:val="both"/>
+        <w:rPr>
+          <w:rFonts w:ascii="IBM Plex Sans" w:cs="IBM Plex Sans" w:eastAsia="IBM Plex Sans" w:hAnsi="IBM Plex Sans"/>
+          <w:sz w:val="22"/>
+          <w:szCs w:val="22"/>
+        </w:rPr>
+      </w:pPr>
+      <w:r>
+        <w:rPr>
+          <w:rFonts w:ascii="IBM Plex Sans" w:cs="IBM Plex Sans" w:eastAsia="IBM Plex Sans" w:hAnsi="IBM Plex Sans"/>
+          <w:b w:val="1"/>
+          <w:bCs w:val="1"/>
+          <w:sz w:val="22"/>
+          <w:szCs w:val="22"/>
+          <w:rtl w:val="0"/>
+        </w:rPr>
+        <w:t xml:space="preserve">19/10/2026: La barra del editor muestra en qué pasada de la fila va el telar, por ejemplo «Fila 2 / 7 · pasada 45 de 120», y en un intercalado «pasada 57 de 120 del intercalado». Sirve para saber por qué parte del dibujo va la tela cuando una fila se teje muchas pasadas seguidas.</w:t>
       </w:r>
     </w:p>
     <w:sectPr>

</xml_diff>

<commit_message>
Solo sensado y vista para los clientes con una clave por tejido
- Solo sensado: un interruptor en la barra del editor apaga el control
  del telar desde la página (sin pulsos de Marcha, Pausa ni Retroceder)
  y el sensado sigue. Migración 023, PUT /api/telares/:id/control-web,
  409 CONTROL_WEB_DESACTIVADO y el firmware que no pulsa los relés.
- Vista para clientes: cada dibujo puede tener una clave TEJ-XXXX-XXXX
  (hash + copia cifrada, migración 024). El cliente entra con ella y ve
  solo su tejido, sin ningún control. Rutas /api/cliente/* con cookie
  propia y límite de intentos fallidos.
- Pruebas, documentos (Word, PDF, Markdown, diagramas, checklist) y
  registro de cambios al día.

Co-Authored-By: Claude Opus 5.5 <noreply@anthropic.com>
Claude-Session: https://claude.ai/code/session_01QiY8ZZNAM9gwPKiqSkCaaj
</commit_message>
<xml_diff>
--- a/documentacion_proyecto/Bitácora.docx
+++ b/documentacion_proyecto/Bitácora.docx
@@ -5181,6 +5181,27 @@
           <w:rtl w:val="0"/>
         </w:rPr>
         <w:t xml:space="preserve">19/10/2026: La barra del editor muestra en qué pasada de la fila va el telar, por ejemplo «Fila 2 / 7 · pasada 45 de 120», y en un intercalado «pasada 57 de 120 del intercalado». Sirve para saber por qué parte del dibujo va la tela cuando una fila se teje muchas pasadas seguidas. Se fijó además el valor por hora de Electrónica (30 USD) y de Multimedios (27 USD), que no lo tenían: con eso el presupuesto pasa a $39.446.255 (costo $31.557.004 y ganancia $7.889.251), y en la planilla del Gantt cada renglón de la Estimación de Costos toma las horas y el valor de su propio rol.</w:t>
+      </w:r>
+    </w:p>
+    <w:p>
+      <w:pPr>
+        <w:jc w:val="both"/>
+        <w:rPr>
+          <w:rFonts w:ascii="IBM Plex Sans" w:cs="IBM Plex Sans" w:eastAsia="IBM Plex Sans" w:hAnsi="IBM Plex Sans"/>
+          <w:sz w:val="22"/>
+          <w:szCs w:val="22"/>
+        </w:rPr>
+      </w:pPr>
+      <w:r>
+        <w:rPr>
+          <w:rFonts w:ascii="IBM Plex Sans" w:cs="IBM Plex Sans" w:eastAsia="IBM Plex Sans" w:hAnsi="IBM Plex Sans"/>
+          <w:b w:val="1"/>
+          <w:bCs w:val="1"/>
+          <w:sz w:val="22"/>
+          <w:szCs w:val="22"/>
+          <w:rtl w:val="0"/>
+        </w:rPr>
+        <w:t xml:space="preserve">20/10/2026: Se sumaron dos funciones a la aplicación. El modo solo sensado: un interruptor en la barra de estado del editor apaga y prende el control del telar desde la página. Apagado, la página no arranca, no pausa ni retrocede la máquina (el backend rechaza las órdenes y el ESP32 no acciona ningún relé, aunque cambie el estado), ▶ solo carga el dibujo y la máquina arranca con Marcha en la botonera; el sensado de la botonera y del sensor sigue igual y la página lleva la cuenta. La vista para clientes: cada dibujo puede tener una clave (TEJ-XXXX-XXXX), que el operario genera desde la ficha del dibujo; con «Soy cliente: ver mi tejido» el cliente entra y ve solo ese tejido, sin controles: si se está tejiendo, por qué fila y pasada va, los metros, cuánto lleva de su pedido y la vista previa de la tela. La clave se guarda con hash y cifrada, y generar una nueva invalida la anterior. Se agregaron las migraciones 023 y 024 (la base pasa a diez tablas) y se actualizaron los manuales, la documentación, los diagramas de la base y las capturas.</w:t>
       </w:r>
     </w:p>
     <w:sectPr>

</xml_diff>

<commit_message>
Las cinco plaquetas soldadas, terminadas, en toda la documentación
La tarea 7,2 del Gantt está al 100 %: los Word (Documentación de Proyecto, Estado, Bitácora,
Árbol, Guía de los relés, Manual del telar, Parado automático), sus PDF, la Lista de componentes
y los Markdown ya no dan las plaquetas como pendientes. Quedan el gabinete en la planta y los
otros tres canales.

Co-Authored-By: Claude Opus 5.5 <noreply@anthropic.com>
Claude-Session: https://claude.ai/code/session_01QiY8ZZNAM9gwPKiqSkCaaj
</commit_message>
<xml_diff>
--- a/documentacion_proyecto/Bitácora.docx
+++ b/documentacion_proyecto/Bitácora.docx
@@ -1672,7 +1672,7 @@
           <w:szCs w:val="22"/>
           <w:rtl w:val="0"/>
         </w:rPr>
-        <w:t xml:space="preserve">Reemplazar a la máquina lectora significa que el sistema no solo dé Marcha, sino que le entregue al telar la secuencia completa del dibujo (qué bobina se activa en cada pasada), ocupando el lugar de la cinta perforada. En este telar, la secuencia la lee un lector óptico sobre una cinta de papel perforada: con agujero, el lector da la señal que activa la bobina de selección de esa pasada. Llegar al Nivel 2 implica que esa señal la dé el sistema: un relé LCA110 en el lugar de cada lector óptico, comandado por el ESP32 con la secuencia que recibe del backend, y un sensor inductivo que cuenta las pasadas. Es un proyecto de hardware en sí mismo, y es el que se está desarrollando actualmente: se probó en protoboard el 10/10/2026 y en el telar el 17/10/2026 (el sensor de pasada y el primer canal), y se están armando las plaquetas.</w:t>
+        <w:t xml:space="preserve">Reemplazar a la máquina lectora significa que el sistema no solo dé Marcha, sino que le entregue al telar la secuencia completa del dibujo (qué bobina se activa en cada pasada), ocupando el lugar de la cinta perforada. En este telar, la secuencia la lee un lector óptico sobre una cinta de papel perforada: con agujero, el lector da la señal que activa la bobina de selección de esa pasada. Llegar al Nivel 2 implica que esa señal la dé el sistema: un relé LCA110 en el lugar de cada lector óptico, comandado por el ESP32 con la secuencia que recibe del backend, y un sensor inductivo que cuenta las pasadas. Es un proyecto de hardware en sí mismo, y es el que se está desarrollando actualmente: se probó en protoboard el 10/10/2026 y en el telar el 17/10/2026 (el sensor de pasada y el primer canal), y al 20/10/2026 quedaron soldadas las plaquetas.</w:t>
       </w:r>
     </w:p>
     <w:p>
@@ -5461,7 +5461,7 @@
           <w:szCs w:val="22"/>
           <w:rtl w:val="0"/>
         </w:rPr>
-        <w:t xml:space="preserve">Se sumaron dos funciones a la aplicación. El modo solo sensado: un interruptor en la barra de estado del editor apaga y prende el control del telar desde la página. Apagado, la página no arranca, no pausa ni retrocede la máquina (el backend rechaza las órdenes y el ESP32 no acciona ningún relé, aunque cambie el estado), ▶ solo carga el dibujo y la máquina arranca con Marcha en la botonera; el sensado de la botonera y del sensor sigue igual y la página lleva la cuenta. La vista para clientes: cada dibujo puede tener una clave (TEJ-XXXX-XXXX), que el operario genera desde la ficha del dibujo; con «Soy cliente: ver mi tejido» el cliente entra y ve solo ese tejido, sin controles: si se está tejiendo, por qué fila y pasada va, los metros, cuánto lleva de su pedido y la vista previa de la tela. La clave se guarda con hash y cifrada, y generar una nueva invalida la anterior. Se agregaron las migraciones 023 y 024 (la base pasa a diez tablas) y se actualizaron los manuales, la documentación, los diagramas de la base y las capturas. En el Gantt se sumaron las tareas de las dos funciones (7,12 a 7,14) y se registró lo hecho el 17/10: quedan 169 tareas y 643 horas, y con ellas el presupuesto pasa a $40.095.441 (costo $32.076.353 y ganancia $8.019.088).</w:t>
+        <w:t xml:space="preserve">Se sumaron dos funciones a la aplicación. El modo solo sensado: un interruptor en la barra de estado del editor apaga y prende el control del telar desde la página. Apagado, la página no arranca, no pausa ni retrocede la máquina (el backend rechaza las órdenes y el ESP32 no acciona ningún relé, aunque cambie el estado), ▶ solo carga el dibujo y la máquina arranca con Marcha en la botonera; el sensado de la botonera y del sensor sigue igual y la página lleva la cuenta. La vista para clientes: cada dibujo puede tener una clave (TEJ-XXXX-XXXX), que el operario genera desde la ficha del dibujo; con «Soy cliente: ver mi tejido» el cliente entra y ve solo ese tejido, sin controles: si se está tejiendo, por qué fila y pasada va, los metros, cuánto lleva de su pedido y la vista previa de la tela. La clave se guarda con hash y cifrada, y generar una nueva invalida la anterior. Se agregaron las migraciones 023 y 024 (la base pasa a diez tablas) y se actualizaron los manuales, la documentación, los diagramas de la base y las capturas. En el Gantt se sumaron las tareas de las dos funciones (7,12 a 7,14) y se registró lo hecho el 17/10: quedan 169 tareas y 643 horas, y con ellas el presupuesto pasa a $40.095.441 (costo $32.076.353 y ganancia $8.019.088). Además, quedaron terminadas las cinco plaquetas soldadas (la tarea 7,2 del Gantt, completa): siguen instalar el gabinete en la planta y conectar los otros tres canales.</w:t>
       </w:r>
     </w:p>
     <w:sectPr>

</xml_diff>